<commit_message>
feat: activate AWS AIF-C01 cert with Credly verification link
- Mark AWS Certified AI Practitioner (AIF-C01) as active (2026)
- Add Credly badge verification URL to data.ts
- Render "Verify credential" link on active cert cards in Certifications.tsx
- Update tagline and summary to reflect active certification
- Update public resume .docx and .pdf with AIF-C01 active status and Credly link

Co-Authored-By: Claude Sonnet 4.6 <noreply@anthropic.com>
Claude-Session: https://claude.ai/code/session_01Rba57icqxyfVntXD9LJuLU
</commit_message>
<xml_diff>
--- a/public/adalberto-silveira-resume-2026.docx
+++ b/public/adalberto-silveira-resume-2026.docx
@@ -1290,6 +1290,19 @@
         </w:rPr>
         <w:t xml:space="preserve">AWS Certified AI Practitioner (AIF-C01)  —  Active 2026</w:t>
       </w:r>
+      <w:hyperlink xmlns:r="http://schemas.openxmlformats.org/officeDocument/2006/relationships" r:id="rIdcredlyaifpractitioner01" w:history="1">
+        <w:r>
+          <w:rPr>
+            <w:rFonts w:ascii="Calibri" w:cs="Calibri" w:eastAsia="Calibri" w:hAnsi="Calibri"/>
+            <w:color w:val="2d2d2d"/>
+            <w:sz w:val="19"/>
+            <w:szCs w:val="19"/>
+            <w:color w:val="1E3A5F"/>
+            <w:u w:val="single"/>
+          </w:rPr>
+          <w:t xml:space="preserve"> · Verify on Credly ↗</w:t>
+        </w:r>
+      </w:hyperlink>
     </w:p>
     <w:p>
       <w:pPr>

</xml_diff>